<commit_message>
Add MKP umbrella discussion as agenda item 3
Insert a new steering committee agenda item covering the pros and cons
of staying under the MKP umbrella versus going it alone, and shift the
remaining items from 3-11 to 4-12.

Also renumber the cross-references that pointed at the old positions:
the Discussion Notes headings (3->4, 4->5, 5->6, 8->9) and the corporate
name decision's agenda item reference (4->5).

Co-Authored-By: Claude Opus 5 (1M context) <noreply@anthropic.com>
</commit_message>
<xml_diff>
--- a/GMC_Steering_Committee_Agenda_2026-09-24.docx
+++ b/GMC_Steering_Committee_Agenda_2026-09-24.docx
@@ -451,7 +451,7 @@
           </w:tcPr>
           <w:p>
             <w:r>
-              <w:t>3</w:t>
+              <w:t xml:space="preserve">3</w:t>
             </w:r>
           </w:p>
         </w:tc>
@@ -473,7 +473,7 @@
           </w:tcPr>
           <w:p>
             <w:r>
-              <w:t>Corporate name selection and availability</w:t>
+              <w:t xml:space="preserve">Discuss the pros and cons of staying under the MKP umbrella, or going it alone</w:t>
             </w:r>
           </w:p>
         </w:tc>
@@ -547,7 +547,7 @@
           </w:tcPr>
           <w:p>
             <w:r>
-              <w:t>4</w:t>
+              <w:t xml:space="preserve">4</w:t>
             </w:r>
           </w:p>
         </w:tc>
@@ -569,7 +569,7 @@
           </w:tcPr>
           <w:p>
             <w:r>
-              <w:t>Select the name for the corporation: "Gold Mining Circle," "Gold Mining Circle Foundation," or "Gold Mining Foundation"</w:t>
+              <w:t>Corporate name selection and availability</w:t>
             </w:r>
           </w:p>
         </w:tc>
@@ -643,7 +643,7 @@
           </w:tcPr>
           <w:p>
             <w:r>
-              <w:t>5</w:t>
+              <w:t xml:space="preserve">5</w:t>
             </w:r>
           </w:p>
         </w:tc>
@@ -665,7 +665,7 @@
           </w:tcPr>
           <w:p>
             <w:r>
-              <w:t>Board of directors: composition and recruitment</w:t>
+              <w:t>Select the name for the corporation: "Gold Mining Circle," "Gold Mining Circle Foundation," or "Gold Mining Foundation"</w:t>
             </w:r>
           </w:p>
         </w:tc>
@@ -739,7 +739,7 @@
           </w:tcPr>
           <w:p>
             <w:r>
-              <w:t>6</w:t>
+              <w:t xml:space="preserve">6</w:t>
             </w:r>
           </w:p>
         </w:tc>
@@ -761,7 +761,7 @@
           </w:tcPr>
           <w:p>
             <w:r>
-              <w:t>Agent for service of process (California)</w:t>
+              <w:t>Board of directors: composition and recruitment</w:t>
             </w:r>
           </w:p>
         </w:tc>
@@ -835,7 +835,7 @@
           </w:tcPr>
           <w:p>
             <w:r>
-              <w:t>7</w:t>
+              <w:t xml:space="preserve">7</w:t>
             </w:r>
           </w:p>
         </w:tc>
@@ -857,7 +857,7 @@
           </w:tcPr>
           <w:p>
             <w:r>
-              <w:t>Articles of Incorporation and bylaws</w:t>
+              <w:t>Agent for service of process (California)</w:t>
             </w:r>
           </w:p>
         </w:tc>
@@ -931,7 +931,7 @@
           </w:tcPr>
           <w:p>
             <w:r>
-              <w:t>8</w:t>
+              <w:t xml:space="preserve">8</w:t>
             </w:r>
           </w:p>
         </w:tc>
@@ -953,7 +953,7 @@
           </w:tcPr>
           <w:p>
             <w:r>
-              <w:t>IRS application: Form 1023 vs. Form 1023-EZ</w:t>
+              <w:t>Articles of Incorporation and bylaws</w:t>
             </w:r>
           </w:p>
         </w:tc>
@@ -1027,7 +1027,7 @@
           </w:tcPr>
           <w:p>
             <w:r>
-              <w:t>9</w:t>
+              <w:t xml:space="preserve">9</w:t>
             </w:r>
           </w:p>
         </w:tc>
@@ -1049,7 +1049,7 @@
           </w:tcPr>
           <w:p>
             <w:r>
-              <w:t>Budget, fees, and funding for formation costs</w:t>
+              <w:t>IRS application: Form 1023 vs. Form 1023-EZ</w:t>
             </w:r>
           </w:p>
         </w:tc>
@@ -1123,7 +1123,7 @@
           </w:tcPr>
           <w:p>
             <w:r>
-              <w:t>10</w:t>
+              <w:t xml:space="preserve">10</w:t>
             </w:r>
           </w:p>
         </w:tc>
@@ -1145,7 +1145,7 @@
           </w:tcPr>
           <w:p>
             <w:r>
-              <w:t>Timeline and assignment of next steps</w:t>
+              <w:t>Budget, fees, and funding for formation costs</w:t>
             </w:r>
           </w:p>
         </w:tc>
@@ -1219,7 +1219,103 @@
           </w:tcPr>
           <w:p>
             <w:r>
-              <w:t>11</w:t>
+              <w:t xml:space="preserve">11</w:t>
+            </w:r>
+          </w:p>
+        </w:tc>
+        <w:tc>
+          <w:tcPr>
+            <w:tcW w:w="4560" w:type="dxa"/>
+            <w:tcBorders>
+              <w:top w:val="single" w:sz="4" w:space="0" w:color="BFBFBF"/>
+              <w:left w:val="single" w:sz="4" w:space="0" w:color="BFBFBF"/>
+              <w:bottom w:val="single" w:sz="4" w:space="0" w:color="BFBFBF"/>
+              <w:right w:val="single" w:sz="4" w:space="0" w:color="BFBFBF"/>
+            </w:tcBorders>
+            <w:tcMar>
+              <w:top w:w="60" w:type="dxa"/>
+              <w:left w:w="100" w:type="dxa"/>
+              <w:bottom w:w="60" w:type="dxa"/>
+              <w:right w:w="100" w:type="dxa"/>
+            </w:tcMar>
+          </w:tcPr>
+          <w:p>
+            <w:r>
+              <w:t>Timeline and assignment of next steps</w:t>
+            </w:r>
+          </w:p>
+        </w:tc>
+        <w:tc>
+          <w:tcPr>
+            <w:tcW w:w="1900" w:type="dxa"/>
+            <w:tcBorders>
+              <w:top w:val="single" w:sz="4" w:space="0" w:color="BFBFBF"/>
+              <w:left w:val="single" w:sz="4" w:space="0" w:color="BFBFBF"/>
+              <w:bottom w:val="single" w:sz="4" w:space="0" w:color="BFBFBF"/>
+              <w:right w:val="single" w:sz="4" w:space="0" w:color="BFBFBF"/>
+            </w:tcBorders>
+            <w:tcMar>
+              <w:top w:w="60" w:type="dxa"/>
+              <w:left w:w="100" w:type="dxa"/>
+              <w:bottom w:w="60" w:type="dxa"/>
+              <w:right w:w="100" w:type="dxa"/>
+            </w:tcMar>
+          </w:tcPr>
+          <w:p>
+            <w:r>
+              <w:t>[TBD]</w:t>
+            </w:r>
+          </w:p>
+        </w:tc>
+        <w:tc>
+          <w:tcPr>
+            <w:tcW w:w="2000" w:type="dxa"/>
+            <w:tcBorders>
+              <w:top w:val="single" w:sz="4" w:space="0" w:color="BFBFBF"/>
+              <w:left w:val="single" w:sz="4" w:space="0" w:color="BFBFBF"/>
+              <w:bottom w:val="single" w:sz="4" w:space="0" w:color="BFBFBF"/>
+              <w:right w:val="single" w:sz="4" w:space="0" w:color="BFBFBF"/>
+            </w:tcBorders>
+            <w:tcMar>
+              <w:top w:w="60" w:type="dxa"/>
+              <w:left w:w="100" w:type="dxa"/>
+              <w:bottom w:w="60" w:type="dxa"/>
+              <w:right w:w="100" w:type="dxa"/>
+            </w:tcMar>
+          </w:tcPr>
+          <w:p>
+            <w:r>
+              <w:t>[TBD]</w:t>
+            </w:r>
+          </w:p>
+        </w:tc>
+      </w:tr>
+      <w:tr>
+        <w:tblPrEx>
+          <w:tblCellMar>
+            <w:top w:w="0" w:type="dxa"/>
+            <w:bottom w:w="0" w:type="dxa"/>
+          </w:tblCellMar>
+        </w:tblPrEx>
+        <w:tc>
+          <w:tcPr>
+            <w:tcW w:w="900" w:type="dxa"/>
+            <w:tcBorders>
+              <w:top w:val="single" w:sz="4" w:space="0" w:color="BFBFBF"/>
+              <w:left w:val="single" w:sz="4" w:space="0" w:color="BFBFBF"/>
+              <w:bottom w:val="single" w:sz="4" w:space="0" w:color="BFBFBF"/>
+              <w:right w:val="single" w:sz="4" w:space="0" w:color="BFBFBF"/>
+            </w:tcBorders>
+            <w:tcMar>
+              <w:top w:w="60" w:type="dxa"/>
+              <w:left w:w="100" w:type="dxa"/>
+              <w:bottom w:w="60" w:type="dxa"/>
+              <w:right w:w="100" w:type="dxa"/>
+            </w:tcMar>
+          </w:tcPr>
+          <w:p>
+            <w:r>
+              <w:t xml:space="preserve">12</w:t>
             </w:r>
           </w:p>
         </w:tc>
@@ -1304,7 +1400,7 @@
         <w:pStyle w:val="Heading2"/>
       </w:pPr>
       <w:r>
-        <w:t>3. Corporate name selection and availability</w:t>
+        <w:t>4. Corporate name selection and availability</w:t>
       </w:r>
     </w:p>
     <w:p>
@@ -1393,7 +1489,7 @@
         <w:pStyle w:val="Heading2"/>
       </w:pPr>
       <w:r>
-        <w:t>4. Select the name for the corporation</w:t>
+        <w:t>5. Select the name for the corporation</w:t>
       </w:r>
     </w:p>
     <w:p>
@@ -1506,7 +1602,7 @@
         <w:pStyle w:val="Heading2"/>
       </w:pPr>
       <w:r>
-        <w:t>5. Board of directors</w:t>
+        <w:t>6. Board of directors</w:t>
       </w:r>
     </w:p>
     <w:p>
@@ -1540,7 +1636,7 @@
         <w:pStyle w:val="Heading2"/>
       </w:pPr>
       <w:r>
-        <w:t>8. IRS application</w:t>
+        <w:t>9. IRS application</w:t>
       </w:r>
     </w:p>
     <w:p>
@@ -1776,7 +1872,7 @@
           </w:tcPr>
           <w:p>
             <w:r>
-              <w:t>4</w:t>
+              <w:t>5</w:t>
             </w:r>
           </w:p>
         </w:tc>

</xml_diff>